<commit_message>
OnePager v2: strikt auf PP-Inhalte reduziert
</commit_message>
<xml_diff>
--- a/pilot-ergebnisse/Pilotauswertung_OnePager.docx
+++ b/pilot-ergebnisse/Pilotauswertung_OnePager.docx
@@ -17,7 +17,7 @@
     </w:p>
     <w:p>
       <w:pPr>
-        <w:spacing w:after="120"/>
+        <w:spacing w:after="160"/>
       </w:pPr>
       <w:r>
         <w:rPr>
@@ -25,30 +25,6 @@
           <w:sz w:val="18"/>
         </w:rPr>
         <w:t>Zusammenfassung · Pilotlaufzeit: 01.02.–31.03.2026</w:t>
-      </w:r>
-    </w:p>
-    <w:p/>
-    <w:p>
-      <w:pPr>
-        <w:pStyle w:val="Heading2"/>
-      </w:pPr>
-      <w:r>
-        <w:rPr>
-          <w:color w:val="1F497D"/>
-          <w:sz w:val="22"/>
-        </w:rPr>
-        <w:t>Was wir gemessen haben</w:t>
-      </w:r>
-    </w:p>
-    <w:p>
-      <w:pPr>
-        <w:spacing w:after="120"/>
-      </w:pPr>
-      <w:r>
-        <w:rPr>
-          <w:sz w:val="20"/>
-        </w:rPr>
-        <w:t>133 Lehrkräfte, Schulleitungen und Verwaltungsmitarbeitende haben ila über 60 Tage genutzt. Ausgewertet wurden 15.344 Datensätze aus dem Nutzerverhalten, 32 In-App-Feedbacks sowie 19 ausgefüllte Abschlussfragebögen.</w:t>
       </w:r>
     </w:p>
     <w:p>
@@ -60,7 +36,7 @@
           <w:color w:val="1F497D"/>
           <w:sz w:val="22"/>
         </w:rPr>
-        <w:t>Was die Daten zeigen</w:t>
+        <w:t>Datenbasis</w:t>
       </w:r>
     </w:p>
     <w:p>
@@ -69,43 +45,23 @@
       </w:pPr>
       <w:r>
         <w:rPr>
-          <w:b/>
           <w:sz w:val="20"/>
         </w:rPr>
-        <w:t xml:space="preserve">Nutzung: </w:t>
-      </w:r>
-      <w:r>
-        <w:rPr>
-          <w:sz w:val="20"/>
-        </w:rPr>
-        <w:t>335 Förderungen wurden angelegt, 176 Förderpläne erstellt. 82 % der Pläne entstehen direkt nach Anlage der Förderung — der Workflow funktioniert. Technische Stabilität und Bedienbarkeit werden durchgängig positiv bewertet (Ø 3,85 von 4).</w:t>
+        <w:t>133 Nutzer · 312 bearbeitete Schüler · 15.344 erfasste Datensätze</w:t>
+        <w:br/>
+        <w:t>Auswertungsquellen: Nutzerverhalten (anonymisiert) · In-App-Feedback · Abschlussumfrage (19 TN)</w:t>
       </w:r>
     </w:p>
     <w:p>
       <w:pPr>
-        <w:spacing w:after="80"/>
+        <w:pStyle w:val="Heading2"/>
       </w:pPr>
       <w:r>
         <w:rPr>
-          <w:b/>
-          <w:sz w:val="20"/>
+          <w:color w:val="1F497D"/>
+          <w:sz w:val="22"/>
         </w:rPr>
-        <w:t xml:space="preserve">Fachlicher Inhalt: </w:t>
-      </w:r>
-      <w:r>
-        <w:rPr>
-          <w:sz w:val="20"/>
-        </w:rPr>
-        <w:t>Hier liegt der größte Handlungsbedarf. Der Tiefstwert des gesamten Fragebogens: Ø 2,15 bei der Frage, ob die Förderziele ausreichen — 8 von 13 Lehrkräften verneinen das. Die eigenen Maßnahmen (235 eindeutige Texte, 140 davon mehrfach von verschiedenen Lehrkräften verwendet) sind ein direkter Hinweis auf Lücken im Katalog.</w:t>
-      </w:r>
-    </w:p>
-    <w:p>
-      <w:r>
-        <w:rPr>
-          <w:b/>
-          <w:sz w:val="20"/>
-        </w:rPr>
-        <w:t>Top-3-Probleme aus dem Feedback:</w:t>
+        <w:t>Nutzungsverhalten</w:t>
       </w:r>
     </w:p>
     <w:p>
@@ -117,7 +73,7 @@
         <w:rPr>
           <w:sz w:val="20"/>
         </w:rPr>
-        <w:t>Unterstützer-Feld zu eingeschränkt (nur Vater/Mutter, 6 Nennungen)</w:t>
+        <w:t>335 Förderungen angelegt · 176 Förderpläne erstellt (65 % der Nutzer)</w:t>
       </w:r>
     </w:p>
     <w:p>
@@ -129,7 +85,7 @@
         <w:rPr>
           <w:sz w:val="20"/>
         </w:rPr>
-        <w:t>Maßnahmen zu unkonkret und lückenhaft — wirken wie Ziele, nicht wie Handlungsschritte (8 Nennungen)</w:t>
+        <w:t>82 % der Förderpläne entstehen direkt nach Anlage der Förderung — der Workflow funktioniert</w:t>
       </w:r>
     </w:p>
     <w:p>
@@ -141,7 +97,163 @@
         <w:rPr>
           <w:sz w:val="20"/>
         </w:rPr>
-        <w:t>Keine Bearbeitungsmöglichkeit nach dem Speichern</w:t>
+        <w:t>Häufigste Anlässe: Drohendes Leistungsversagen (48 %), Teilnahme an bes. Fördermaßnahme (41 %)</w:t>
+      </w:r>
+    </w:p>
+    <w:p>
+      <w:pPr>
+        <w:pStyle w:val="ListBullet"/>
+        <w:spacing w:after="40"/>
+      </w:pPr>
+      <w:r>
+        <w:rPr>
+          <w:sz w:val="20"/>
+        </w:rPr>
+        <w:t>Meistgenutzte Förderbereiche: Rechtschreiben (29 %), Kognition (26 %), Rechnen (21 %)</w:t>
+      </w:r>
+    </w:p>
+    <w:p>
+      <w:pPr>
+        <w:pStyle w:val="ListBullet"/>
+        <w:spacing w:after="40"/>
+      </w:pPr>
+      <w:r>
+        <w:rPr>
+          <w:sz w:val="20"/>
+        </w:rPr>
+        <w:t>Klasse 0 (Vorklasse): meistgenutzter Jahrgang (4.526 Einträge) — bei nur 17 Nutzern</w:t>
+      </w:r>
+    </w:p>
+    <w:p>
+      <w:pPr>
+        <w:pStyle w:val="ListBullet"/>
+        <w:spacing w:after="40"/>
+      </w:pPr>
+      <w:r>
+        <w:rPr>
+          <w:sz w:val="20"/>
+        </w:rPr>
+        <w:t>57 % der Nutzer waren nur einmal in der App · 57 % unter 10 Minuten Nutzungsdauer</w:t>
+      </w:r>
+    </w:p>
+    <w:p>
+      <w:pPr>
+        <w:pStyle w:val="Heading2"/>
+      </w:pPr>
+      <w:r>
+        <w:rPr>
+          <w:color w:val="1F497D"/>
+          <w:sz w:val="22"/>
+        </w:rPr>
+        <w:t>Feedback (In-App · Ø 2,7 von 5)</w:t>
+      </w:r>
+    </w:p>
+    <w:p>
+      <w:pPr>
+        <w:spacing w:after="40"/>
+      </w:pPr>
+      <w:r>
+        <w:rPr>
+          <w:b/>
+          <w:sz w:val="20"/>
+        </w:rPr>
+        <w:t>Top-3-Kritikpunkte aus 27 Freitexten:</w:t>
+      </w:r>
+    </w:p>
+    <w:p>
+      <w:pPr>
+        <w:pStyle w:val="ListBullet"/>
+        <w:spacing w:after="40"/>
+      </w:pPr>
+      <w:r>
+        <w:rPr>
+          <w:sz w:val="20"/>
+        </w:rPr>
+        <w:t>Unterstützer-Feld zu eingeschränkt — nur Vater/Mutter auswählbar; BFZ, Ergotherapie, Logopädie, andere Lehrkräfte fehlen (6 Nennungen)</w:t>
+      </w:r>
+    </w:p>
+    <w:p>
+      <w:pPr>
+        <w:pStyle w:val="ListBullet"/>
+        <w:spacing w:after="40"/>
+      </w:pPr>
+      <w:r>
+        <w:rPr>
+          <w:sz w:val="20"/>
+        </w:rPr>
+        <w:t>Maßnahmen unkonkret, lückenhaft, falsche Ebene — wirken wie Ziele statt Handlungsschritte; Vorklasse, Klasse 1, LRS, DaZ nicht abgedeckt (8 Nennungen)</w:t>
+      </w:r>
+    </w:p>
+    <w:p>
+      <w:pPr>
+        <w:pStyle w:val="ListBullet"/>
+        <w:spacing w:after="40"/>
+      </w:pPr>
+      <w:r>
+        <w:rPr>
+          <w:sz w:val="20"/>
+        </w:rPr>
+        <w:t>Fehlende Förderbereiche und Anlässe — Lernverhalten, Sozialverhalten, LRS, AD(H)S, Autismus nicht vorhanden (3 Nennungen)</w:t>
+      </w:r>
+    </w:p>
+    <w:p>
+      <w:pPr>
+        <w:spacing w:after="80"/>
+      </w:pPr>
+      <w:r>
+        <w:rPr>
+          <w:i/>
+          <w:sz w:val="18"/>
+        </w:rPr>
+        <w:t>Hinweis: 101 von 133 Nutzern haben kein Feedback abgegeben.</w:t>
+      </w:r>
+    </w:p>
+    <w:p>
+      <w:pPr>
+        <w:pStyle w:val="Heading2"/>
+      </w:pPr>
+      <w:r>
+        <w:rPr>
+          <w:color w:val="1F497D"/>
+          <w:sz w:val="22"/>
+        </w:rPr>
+        <w:t>Abschlussumfrage (19 Teilnehmende)</w:t>
+      </w:r>
+    </w:p>
+    <w:p>
+      <w:pPr>
+        <w:pStyle w:val="ListBullet"/>
+        <w:spacing w:after="40"/>
+      </w:pPr>
+      <w:r>
+        <w:rPr>
+          <w:sz w:val="20"/>
+        </w:rPr>
+        <w:t>Technik positiv bewertet · Fachlicher Nutzen gespalten</w:t>
+      </w:r>
+    </w:p>
+    <w:p>
+      <w:pPr>
+        <w:pStyle w:val="ListBullet"/>
+        <w:spacing w:after="40"/>
+      </w:pPr>
+      <w:r>
+        <w:rPr>
+          <w:sz w:val="20"/>
+        </w:rPr>
+        <w:t>Schulleitung bewertet durchgängig besser als Lehrkräfte (bei "Arbeit erleichtert": 3,60 vs. 2,62)</w:t>
+      </w:r>
+    </w:p>
+    <w:p>
+      <w:pPr>
+        <w:pStyle w:val="ListBullet"/>
+        <w:spacing w:after="40"/>
+      </w:pPr>
+      <w:r>
+        <w:rPr>
+          <w:sz w:val="20"/>
+        </w:rPr>
+        <w:t>Tiefstwert gesamt: Ø 2,15 — 8 von 13 Lehrkräften: Förderziele reichen nicht aus</w:t>
       </w:r>
     </w:p>
     <w:p>
@@ -158,13 +270,13 @@
     </w:p>
     <w:p>
       <w:pPr>
-        <w:spacing w:after="120"/>
+        <w:spacing w:after="80"/>
       </w:pPr>
       <w:r>
         <w:rPr>
           <w:sz w:val="20"/>
         </w:rPr>
-        <w:t>ila trifft einen echten Bedarf — und die Schulen wollen tiefer gehen. Die Bereitschaft, Förderprozesse digital abzubilden, ist da. Was die Schulen jetzt einfordern: konkretere Maßnahmen, mehr Förderbereiche, mehr Funktionen rund um den Förderplan. Die Grundlage ist solide. Der nächste Schritt ist inhaltliche Stärke.</w:t>
+        <w:t>ila trifft einen echten Bedarf — und die Schulen wollen tiefer gehen. Die Akzeptanz ist da, der Workflow funktioniert. Was fehlt: fachliche Tiefe bei Maßnahmen, Förderbereichen und Unterstützerfeld. Die eigenen Maßnahmen der Lehrkräfte (235 eindeutige Texte, 140 mehrfach verwendet) sind ein direkter Hinweis auf Kataloglücken — und eine fertige Vorlage für die Weiterentwicklung.</w:t>
       </w:r>
     </w:p>
     <w:p>
@@ -176,218 +288,69 @@
           <w:color w:val="1F497D"/>
           <w:sz w:val="22"/>
         </w:rPr>
-        <w:t>Was das für die Roadmap bedeutet</w:t>
+        <w:t>Roadmap-Impulse</w:t>
       </w:r>
     </w:p>
-    <w:tbl>
-      <w:tblPr>
-        <w:tblStyle w:val="TableGrid"/>
-        <w:tblW w:type="auto" w:w="0"/>
-        <w:tblLook w:firstColumn="1" w:firstRow="1" w:lastColumn="0" w:lastRow="0" w:noHBand="0" w:noVBand="1" w:val="04A0"/>
-      </w:tblPr>
-      <w:tblGrid>
-        <w:gridCol w:w="4986"/>
-        <w:gridCol w:w="4986"/>
-      </w:tblGrid>
-      <w:tr>
-        <w:tc>
-          <w:tcPr>
-            <w:tcW w:type="dxa" w:w="4986"/>
-          </w:tcPr>
-          <w:p>
-            <w:r>
-              <w:rPr>
-                <w:b/>
-                <w:sz w:val="18"/>
-              </w:rPr>
-              <w:t>Priorität</w:t>
-            </w:r>
-          </w:p>
-        </w:tc>
-        <w:tc>
-          <w:tcPr>
-            <w:tcW w:type="dxa" w:w="4986"/>
-          </w:tcPr>
-          <w:p>
-            <w:r>
-              <w:rPr>
-                <w:b/>
-                <w:sz w:val="18"/>
-              </w:rPr>
-              <w:t>Maßnahme</w:t>
-            </w:r>
-          </w:p>
-        </w:tc>
-      </w:tr>
-      <w:tr>
-        <w:tc>
-          <w:tcPr>
-            <w:tcW w:type="dxa" w:w="4986"/>
-          </w:tcPr>
-          <w:p>
-            <w:r>
-              <w:rPr>
-                <w:sz w:val="18"/>
-              </w:rPr>
-              <w:t>Hoch</w:t>
-            </w:r>
-          </w:p>
-        </w:tc>
-        <w:tc>
-          <w:tcPr>
-            <w:tcW w:type="dxa" w:w="4986"/>
-          </w:tcPr>
-          <w:p>
-            <w:r>
-              <w:rPr>
-                <w:sz w:val="18"/>
-              </w:rPr>
-              <w:t>Maßnahmenkatalog überarbeiten (Lücken aus Pilotnachweisen schließen)</w:t>
-            </w:r>
-          </w:p>
-        </w:tc>
-      </w:tr>
-      <w:tr>
-        <w:tc>
-          <w:tcPr>
-            <w:tcW w:type="dxa" w:w="4986"/>
-          </w:tcPr>
-          <w:p>
-            <w:r>
-              <w:rPr>
-                <w:sz w:val="18"/>
-              </w:rPr>
-              <w:t>Hoch</w:t>
-            </w:r>
-          </w:p>
-        </w:tc>
-        <w:tc>
-          <w:tcPr>
-            <w:tcW w:type="dxa" w:w="4986"/>
-          </w:tcPr>
-          <w:p>
-            <w:r>
-              <w:rPr>
-                <w:sz w:val="18"/>
-              </w:rPr>
-              <w:t>Bearbeitbarkeit nach Speichern ermöglichen</w:t>
-            </w:r>
-          </w:p>
-        </w:tc>
-      </w:tr>
-      <w:tr>
-        <w:tc>
-          <w:tcPr>
-            <w:tcW w:type="dxa" w:w="4986"/>
-          </w:tcPr>
-          <w:p>
-            <w:r>
-              <w:rPr>
-                <w:sz w:val="18"/>
-              </w:rPr>
-              <w:t>Hoch</w:t>
-            </w:r>
-          </w:p>
-        </w:tc>
-        <w:tc>
-          <w:tcPr>
-            <w:tcW w:type="dxa" w:w="4986"/>
-          </w:tcPr>
-          <w:p>
-            <w:r>
-              <w:rPr>
-                <w:sz w:val="18"/>
-              </w:rPr>
-              <w:t>Unterstützer-Feld erweitern</w:t>
-            </w:r>
-          </w:p>
-        </w:tc>
-      </w:tr>
-      <w:tr>
-        <w:tc>
-          <w:tcPr>
-            <w:tcW w:type="dxa" w:w="4986"/>
-          </w:tcPr>
-          <w:p>
-            <w:r>
-              <w:rPr>
-                <w:sz w:val="18"/>
-              </w:rPr>
-              <w:t>Mittel</w:t>
-            </w:r>
-          </w:p>
-        </w:tc>
-        <w:tc>
-          <w:tcPr>
-            <w:tcW w:type="dxa" w:w="4986"/>
-          </w:tcPr>
-          <w:p>
-            <w:r>
-              <w:rPr>
-                <w:sz w:val="18"/>
-              </w:rPr>
-              <w:t>Förderbereiche und Anlässe ergänzen (LRS, DaZ, AD(H)S, Vorklasse)</w:t>
-            </w:r>
-          </w:p>
-        </w:tc>
-      </w:tr>
-      <w:tr>
-        <w:tc>
-          <w:tcPr>
-            <w:tcW w:type="dxa" w:w="4986"/>
-          </w:tcPr>
-          <w:p>
-            <w:r>
-              <w:rPr>
-                <w:sz w:val="18"/>
-              </w:rPr>
-              <w:t>Mittel</w:t>
-            </w:r>
-          </w:p>
-        </w:tc>
-        <w:tc>
-          <w:tcPr>
-            <w:tcW w:type="dxa" w:w="4986"/>
-          </w:tcPr>
-          <w:p>
-            <w:r>
-              <w:rPr>
-                <w:sz w:val="18"/>
-              </w:rPr>
-              <w:t>Förderplan-Layout verbessern</w:t>
-            </w:r>
-          </w:p>
-        </w:tc>
-      </w:tr>
-      <w:tr>
-        <w:tc>
-          <w:tcPr>
-            <w:tcW w:type="dxa" w:w="4986"/>
-          </w:tcPr>
-          <w:p>
-            <w:r>
-              <w:rPr>
-                <w:sz w:val="18"/>
-              </w:rPr>
-              <w:t>Ausbaustufe 2</w:t>
-            </w:r>
-          </w:p>
-        </w:tc>
-        <w:tc>
-          <w:tcPr>
-            <w:tcW w:type="dxa" w:w="4986"/>
-          </w:tcPr>
-          <w:p>
-            <w:r>
-              <w:rPr>
-                <w:sz w:val="18"/>
-              </w:rPr>
-              <w:t>Kollegialer Austausch, Dokumentenablage, Kalender/Erinnerung</w:t>
-            </w:r>
-          </w:p>
-        </w:tc>
-      </w:tr>
-    </w:tbl>
+    <w:p>
+      <w:pPr>
+        <w:pStyle w:val="ListBullet"/>
+        <w:spacing w:after="40"/>
+      </w:pPr>
+      <w:r>
+        <w:rPr>
+          <w:sz w:val="20"/>
+        </w:rPr>
+        <w:t>Maßnahmenkatalog überarbeiten (Lücken aus Pilotdaten schließen)</w:t>
+      </w:r>
+    </w:p>
+    <w:p>
+      <w:pPr>
+        <w:pStyle w:val="ListBullet"/>
+        <w:spacing w:after="40"/>
+      </w:pPr>
+      <w:r>
+        <w:rPr>
+          <w:sz w:val="20"/>
+        </w:rPr>
+        <w:t>Unterstützer-Feld erweitern</w:t>
+      </w:r>
+    </w:p>
+    <w:p>
+      <w:pPr>
+        <w:pStyle w:val="ListBullet"/>
+        <w:spacing w:after="40"/>
+      </w:pPr>
+      <w:r>
+        <w:rPr>
+          <w:sz w:val="20"/>
+        </w:rPr>
+        <w:t>Bearbeitbarkeit nach Speichern ermöglichen</w:t>
+      </w:r>
+    </w:p>
+    <w:p>
+      <w:pPr>
+        <w:pStyle w:val="ListBullet"/>
+        <w:spacing w:after="40"/>
+      </w:pPr>
+      <w:r>
+        <w:rPr>
+          <w:sz w:val="20"/>
+        </w:rPr>
+        <w:t>Förderbereiche und Anlässe ergänzen (LRS, DaZ, AD(H)S, Vorklasse)</w:t>
+      </w:r>
+    </w:p>
+    <w:p>
+      <w:pPr>
+        <w:pStyle w:val="ListBullet"/>
+        <w:spacing w:after="40"/>
+      </w:pPr>
+      <w:r>
+        <w:rPr>
+          <w:sz w:val="20"/>
+        </w:rPr>
+        <w:t>Förderplan-Layout verbessern</w:t>
+      </w:r>
+    </w:p>
     <w:p/>
     <w:p>
       <w:r>

</xml_diff>